<commit_message>
content(printables): one label per field, and monolingual body text
- student-ai-use-process-sheet (English): every field description was printed
  twice — the English label and the gloss that survived from the Chinese
  edition. Each prints once now.
- student-ai-use-process-sheet (Chinese): the box descriptions, the rule and the
  box-4 note carried an English sentence each. The body is Chinese only; the
  fill-in field labels (姓名 Name: …) stay bilingual, which is the one bilingual
  element the house style allows.
- first-ai-lesson-kit, family-ai-homework-guide, maths-hint-cards-teacher-controlled
  (Chinese): the lines a person actually writes in now label their fields in both
  languages.
- one-term-ai-education-plan, p4-p6-curriculum-gap-map (Chinese): the fill-in
  column headers carry the English word beside the Chinese, matching the English
  editions.
</commit_message>
<xml_diff>
--- a/public/files/en/student-ai-use-process-sheet.docx
+++ b/public/files/en/student-ai-use-process-sheet.docx
@@ -100,7 +100,7 @@
           <w:color w:val="080808"/>
           <w:sz w:val="21"/>
         </w:rPr>
-        <w:t>First attempt — my own thinking before using AI My first attempt, before using AI</w:t>
+        <w:t>First attempt — my own thinking before using AI</w:t>
       </w:r>
     </w:p>
     <w:p>
@@ -111,7 +111,7 @@
           <w:color w:val="080808"/>
           <w:sz w:val="21"/>
         </w:rPr>
-        <w:t>My prompt — what I asked (write it exactly) My prompt — write exactly what I asked</w:t>
+        <w:t>My prompt — what I asked (write it exactly)</w:t>
       </w:r>
     </w:p>
     <w:p>
@@ -122,7 +122,7 @@
           <w:color w:val="080808"/>
           <w:sz w:val="21"/>
         </w:rPr>
-        <w:t>The AI's answer — what it said (a summary) What the AI said (summary is enough)</w:t>
+        <w:t>The AI's answer — what it said (a summary)</w:t>
       </w:r>
     </w:p>
     <w:p>
@@ -133,7 +133,7 @@
           <w:color w:val="080808"/>
           <w:sz w:val="21"/>
         </w:rPr>
-        <w:t>What I checked — what did I verify or change, and against which source? What I checked or changed, and against which source — THIS IS THE MOST IMPORTANT BOX</w:t>
+        <w:t>What I checked — what did I verify or change, and against which source? (Box 4 — the most important one)</w:t>
       </w:r>
     </w:p>
     <w:p>
@@ -144,7 +144,7 @@
           <w:color w:val="080808"/>
           <w:sz w:val="21"/>
         </w:rPr>
-        <w:t>Final version and explanation — why did I change it this way? Final version + one sentence on what I changed and why</w:t>
+        <w:t>Final version and explanation — why did I change it this way?</w:t>
       </w:r>
     </w:p>
     <w:tbl>

</xml_diff>